<commit_message>
Update docs figures and scaf simulation results
Co-Authored-By: Claude Sonnet 4.6 <noreply@anthropic.com>
</commit_message>
<xml_diff>
--- a/docs/SACF_Methodology_Chapter3.docx
+++ b/docs/SACF_Methodology_Chapter3.docx
@@ -1369,7 +1369,7 @@
       <w:r>
         <w:drawing>
           <wp:inline xmlns:a="http://schemas.openxmlformats.org/drawingml/2006/main" xmlns:pic="http://schemas.openxmlformats.org/drawingml/2006/picture">
-            <wp:extent cx="5394960" cy="2400095"/>
+            <wp:extent cx="5394960" cy="3030593"/>
             <wp:docPr id="6" name="Picture 6"/>
             <wp:cNvGraphicFramePr>
               <a:graphicFrameLocks noChangeAspect="1"/>
@@ -1390,7 +1390,7 @@
                   <pic:spPr>
                     <a:xfrm>
                       <a:off x="0" y="0"/>
-                      <a:ext cx="5394960" cy="2400095"/>
+                      <a:ext cx="5394960" cy="3030593"/>
                     </a:xfrm>
                     <a:prstGeom prst="rect"/>
                   </pic:spPr>

</xml_diff>